<commit_message>
Hardcode post-recommendation flow, fix profile voice input, sequencer improvements
- Add post-recommendation state tracking (recommendationDelivered, happyConfirmed, clientApproachAsked)
- Hardcode happy-detection intercept: advisor confirms happy → ask about client approach
- Post-recommendation AI call uses full conversation history for alternatives/approach guidance
- Fix advisor profile voice bar: always show Tap to speak (not hidden when field has content), remove redundant captured/ready state
- Fix port to 4000 in nuxt.config.js
- Extract client system prompt to data/prompts/client.txt (hot-reloadable without restart)
- Add start-dev.bat for easier dev startup

Co-Authored-By: Claude Sonnet 4.6 <noreply@anthropic.com>
</commit_message>
<xml_diff>
--- a/The 3 Engagement Types.docx
+++ b/The 3 Engagement Types.docx
@@ -847,7 +847,7 @@
       </w:tr>
       <w:tr>
         <w:trPr>
-          <w:trHeight w:val="670"/>
+          <w:trHeight w:val="1038"/>
         </w:trPr>
         <w:tc>
           <w:tcPr>
@@ -977,7 +977,7 @@
       </w:tr>
       <w:tr>
         <w:trPr>
-          <w:trHeight w:val="539"/>
+          <w:trHeight w:val="1050"/>
         </w:trPr>
         <w:tc>
           <w:tcPr>
@@ -2297,6 +2297,7 @@
   <w:style w:type="character" w:default="1" w:styleId="DefaultParagraphFont">
     <w:name w:val="Default Paragraph Font"/>
     <w:uiPriority w:val="1"/>
+    <w:semiHidden/>
     <w:unhideWhenUsed/>
   </w:style>
   <w:style w:type="table" w:default="1" w:styleId="TableNormal">

</xml_diff>